<commit_message>
Upload “src/content/bios/Sweetser, A 2026.docx”
</commit_message>
<xml_diff>
--- a/src/content/bios/Sweetser, A 2026.docx
+++ b/src/content/bios/Sweetser, A 2026.docx
@@ -16,7 +16,23 @@
           <w:b/>
           <w:bCs/>
         </w:rPr>
-        <w:t xml:space="preserve">SWEETSER, ARTHUR, </w:t>
+        <w:t>SWEETSER, A</w:t>
+      </w:r>
+      <w:r>
+        <w:rPr>
+          <w:rFonts w:cs="Times New Roman"/>
+          <w:b/>
+          <w:bCs/>
+        </w:rPr>
+        <w:t>rthur</w:t>
+      </w:r>
+      <w:r>
+        <w:rPr>
+          <w:rFonts w:cs="Times New Roman"/>
+          <w:b/>
+          <w:bCs/>
+        </w:rPr>
+        <w:t xml:space="preserve">, </w:t>
       </w:r>
       <w:r>
         <w:rPr>

</xml_diff>